<commit_message>
Documentation work in progress
</commit_message>
<xml_diff>
--- a/Docs/ARM WindMaster.docx
+++ b/Docs/ARM WindMaster.docx
@@ -18,23 +18,524 @@
         <w:t xml:space="preserve"> Platform</w:t>
       </w:r>
     </w:p>
+    <w:p>
+      <w:pPr>
+        <w:pStyle w:val="Heading1"/>
+      </w:pPr>
+      <w:r>
+        <w:t>System Architecture</w:t>
+      </w:r>
+    </w:p>
+    <w:p>
+      <w:pPr>
+        <w:pStyle w:val="Heading2"/>
+      </w:pPr>
+      <w:r>
+        <w:t>Block Diagram</w:t>
+      </w:r>
+    </w:p>
+    <w:p>
+      <w:pPr>
+        <w:jc w:val="center"/>
+      </w:pPr>
+      <w:r>
+        <w:drawing>
+          <wp:inline distT="0" distB="0" distL="0" distR="0" wp14:anchorId="77F03B57" wp14:editId="562165C6">
+            <wp:extent cx="5353797" cy="6077798"/>
+            <wp:effectExtent l="0" t="0" r="0" b="0"/>
+            <wp:docPr id="1" name="Picture 1"/>
+            <wp:cNvGraphicFramePr>
+              <a:graphicFrameLocks xmlns:a="http://schemas.openxmlformats.org/drawingml/2006/main" noChangeAspect="1"/>
+            </wp:cNvGraphicFramePr>
+            <a:graphic xmlns:a="http://schemas.openxmlformats.org/drawingml/2006/main">
+              <a:graphicData uri="http://schemas.openxmlformats.org/drawingml/2006/picture">
+                <pic:pic xmlns:pic="http://schemas.openxmlformats.org/drawingml/2006/picture">
+                  <pic:nvPicPr>
+                    <pic:cNvPr id="1" name=""/>
+                    <pic:cNvPicPr/>
+                  </pic:nvPicPr>
+                  <pic:blipFill>
+                    <a:blip r:embed="rId5"/>
+                    <a:stretch>
+                      <a:fillRect/>
+                    </a:stretch>
+                  </pic:blipFill>
+                  <pic:spPr>
+                    <a:xfrm>
+                      <a:off x="0" y="0"/>
+                      <a:ext cx="5353797" cy="6077798"/>
+                    </a:xfrm>
+                    <a:prstGeom prst="rect">
+                      <a:avLst/>
+                    </a:prstGeom>
+                  </pic:spPr>
+                </pic:pic>
+              </a:graphicData>
+            </a:graphic>
+          </wp:inline>
+        </w:drawing>
+      </w:r>
+    </w:p>
+    <w:p>
+      <w:pPr>
+        <w:jc w:val="center"/>
+      </w:pPr>
+    </w:p>
+    <w:p>
+      <w:pPr>
+        <w:pStyle w:val="Heading2"/>
+      </w:pPr>
+    </w:p>
+    <w:p>
+      <w:pPr>
+        <w:pStyle w:val="Heading2"/>
+      </w:pPr>
+      <w:r>
+        <w:t>System Init</w:t>
+      </w:r>
+      <w:r>
+        <w:t>ialization</w:t>
+      </w:r>
+    </w:p>
+    <w:p>
+      <w:r>
+        <w:t xml:space="preserve">After the STM32 </w:t>
+      </w:r>
+      <w:r>
+        <w:t xml:space="preserve">Peripheral </w:t>
+      </w:r>
+      <w:r>
+        <w:t>Boilerplate, the system does the following:</w:t>
+      </w:r>
+    </w:p>
+    <w:p>
+      <w:pPr>
+        <w:pStyle w:val="ListParagraph"/>
+        <w:numPr>
+          <w:ilvl w:val="0"/>
+          <w:numId w:val="1"/>
+        </w:numPr>
+      </w:pPr>
+      <w:r>
+        <w:t xml:space="preserve">Begins a 1 MHz timer (TIM2), the </w:t>
+      </w:r>
+      <w:r>
+        <w:t>microsecond</w:t>
+      </w:r>
+      <w:r>
+        <w:t xml:space="preserve"> counter that drives system time.</w:t>
+      </w:r>
+    </w:p>
+    <w:p>
+      <w:pPr>
+        <w:pStyle w:val="ListParagraph"/>
+        <w:numPr>
+          <w:ilvl w:val="0"/>
+          <w:numId w:val="1"/>
+        </w:numPr>
+      </w:pPr>
+      <w:r>
+        <w:t>Starts up the</w:t>
+      </w:r>
+      <w:r>
+        <w:t xml:space="preserve"> RTC and</w:t>
+      </w:r>
+      <w:r>
+        <w:t xml:space="preserve"> </w:t>
+      </w:r>
+      <w:proofErr w:type="spellStart"/>
+      <w:r>
+        <w:t>SysTime</w:t>
+      </w:r>
+      <w:proofErr w:type="spellEnd"/>
+      <w:r>
+        <w:t xml:space="preserve"> module by initializing the global variables and linking to TIM2</w:t>
+      </w:r>
+      <w:r>
+        <w:t>, enabling the 1Hz Pulse from the RTC,</w:t>
+      </w:r>
+      <w:r>
+        <w:t xml:space="preserve"> and setting the firmware time to the value stored in the RTC.</w:t>
+      </w:r>
+    </w:p>
+    <w:p>
+      <w:pPr>
+        <w:pStyle w:val="ListParagraph"/>
+        <w:numPr>
+          <w:ilvl w:val="0"/>
+          <w:numId w:val="1"/>
+        </w:numPr>
+      </w:pPr>
+      <w:r>
+        <w:t>Starts the Filesystem module by initializing buffers and setting the FATFS path.</w:t>
+      </w:r>
+    </w:p>
+    <w:p>
+      <w:pPr>
+        <w:pStyle w:val="ListParagraph"/>
+        <w:numPr>
+          <w:ilvl w:val="0"/>
+          <w:numId w:val="1"/>
+        </w:numPr>
+      </w:pPr>
+      <w:r>
+        <w:t>Starts the Tasker module by initializing an empty task queue.</w:t>
+      </w:r>
+    </w:p>
+    <w:p>
+      <w:pPr>
+        <w:pStyle w:val="ListParagraph"/>
+        <w:numPr>
+          <w:ilvl w:val="0"/>
+          <w:numId w:val="1"/>
+        </w:numPr>
+      </w:pPr>
+      <w:r>
+        <w:t>Starts the Calculator module by initializing buffers and the calculation state.</w:t>
+      </w:r>
+    </w:p>
+    <w:p>
+      <w:pPr>
+        <w:pStyle w:val="ListParagraph"/>
+        <w:numPr>
+          <w:ilvl w:val="0"/>
+          <w:numId w:val="1"/>
+        </w:numPr>
+      </w:pPr>
+      <w:r>
+        <w:t>Initializes the RS232 Transc</w:t>
+      </w:r>
+      <w:r>
+        <w:t>eivers by powering them on with GPIO pins.</w:t>
+      </w:r>
+    </w:p>
+    <w:p>
+      <w:pPr>
+        <w:pStyle w:val="ListParagraph"/>
+        <w:numPr>
+          <w:ilvl w:val="0"/>
+          <w:numId w:val="1"/>
+        </w:numPr>
+      </w:pPr>
+      <w:r>
+        <w:t>Initializes the UARTs by clearing all of the flags.</w:t>
+      </w:r>
+    </w:p>
+    <w:p>
+      <w:pPr>
+        <w:pStyle w:val="ListParagraph"/>
+        <w:numPr>
+          <w:ilvl w:val="0"/>
+          <w:numId w:val="1"/>
+        </w:numPr>
+      </w:pPr>
+      <w:r>
+        <w:t xml:space="preserve">Initializes the </w:t>
+      </w:r>
+      <w:proofErr w:type="spellStart"/>
+      <w:r>
+        <w:t>Windmaster</w:t>
+      </w:r>
+      <w:proofErr w:type="spellEnd"/>
+      <w:r>
+        <w:t xml:space="preserve"> sensor by</w:t>
+      </w:r>
+      <w:r>
+        <w:t xml:space="preserve"> setting up the DMA buffers and</w:t>
+      </w:r>
+      <w:r>
+        <w:t xml:space="preserve"> sending */r/n </w:t>
+      </w:r>
+      <w:r>
+        <w:t>to put</w:t>
+      </w:r>
+      <w:r>
+        <w:t xml:space="preserve"> it in configuration mode.</w:t>
+      </w:r>
+    </w:p>
+    <w:p>
+      <w:pPr>
+        <w:pStyle w:val="ListParagraph"/>
+        <w:numPr>
+          <w:ilvl w:val="0"/>
+          <w:numId w:val="1"/>
+        </w:numPr>
+      </w:pPr>
+      <w:r>
+        <w:t xml:space="preserve">Initializes the </w:t>
+      </w:r>
+      <w:proofErr w:type="spellStart"/>
+      <w:r>
+        <w:t>Vectornav</w:t>
+      </w:r>
+      <w:proofErr w:type="spellEnd"/>
+      <w:r>
+        <w:t xml:space="preserve"> by</w:t>
+      </w:r>
+      <w:r>
+        <w:t xml:space="preserve"> setting up the DMA buffers and</w:t>
+      </w:r>
+      <w:r>
+        <w:t xml:space="preserve"> sending the stop-async command.</w:t>
+      </w:r>
+    </w:p>
+    <w:p>
+      <w:pPr>
+        <w:pStyle w:val="ListParagraph"/>
+        <w:numPr>
+          <w:ilvl w:val="0"/>
+          <w:numId w:val="1"/>
+        </w:numPr>
+      </w:pPr>
+      <w:r>
+        <w:t xml:space="preserve">Initializes the </w:t>
+      </w:r>
+      <w:proofErr w:type="spellStart"/>
+      <w:r>
+        <w:t>Telus</w:t>
+      </w:r>
+      <w:proofErr w:type="spellEnd"/>
+      <w:r>
+        <w:t xml:space="preserve"> module by setting up the DMA and clearing buffers.</w:t>
+      </w:r>
+    </w:p>
+    <w:p>
+      <w:pPr>
+        <w:pStyle w:val="ListParagraph"/>
+        <w:numPr>
+          <w:ilvl w:val="0"/>
+          <w:numId w:val="1"/>
+        </w:numPr>
+      </w:pPr>
+      <w:r>
+        <w:t xml:space="preserve">The system then polls the </w:t>
+      </w:r>
+      <w:proofErr w:type="spellStart"/>
+      <w:r>
+        <w:t>Vectornav</w:t>
+      </w:r>
+      <w:proofErr w:type="spellEnd"/>
+      <w:r>
+        <w:t xml:space="preserve"> for a GPS fix and syncs both the RTC and System times to GPS time.</w:t>
+      </w:r>
+    </w:p>
+    <w:p>
+      <w:pPr>
+        <w:pStyle w:val="ListParagraph"/>
+        <w:numPr>
+          <w:ilvl w:val="0"/>
+          <w:numId w:val="1"/>
+        </w:numPr>
+      </w:pPr>
+      <w:r>
+        <w:t>The System enters the main While-Loop.</w:t>
+      </w:r>
+    </w:p>
+    <w:p>
+      <w:pPr>
+        <w:pStyle w:val="Heading2"/>
+      </w:pPr>
+      <w:r>
+        <w:t>System Time</w:t>
+      </w:r>
+    </w:p>
+    <w:p>
+      <w:r>
+        <w:t xml:space="preserve">The internal system time relies on a 1 MHz </w:t>
+      </w:r>
+      <w:r>
+        <w:t>microsecond</w:t>
+      </w:r>
+      <w:r>
+        <w:t xml:space="preserve"> counter</w:t>
+      </w:r>
+      <w:r>
+        <w:t xml:space="preserve"> (TIM2)</w:t>
+      </w:r>
+      <w:r>
+        <w:t xml:space="preserve"> which is corrected with the reliable 1 Hz Pulse-Per-Second output of the AB-RTCMC.</w:t>
+      </w:r>
+    </w:p>
+    <w:p>
+      <w:r>
+        <w:t>Each time the system receives a pulse from the AB-RTCMC, the PPS event interrupt is triggered:</w:t>
+      </w:r>
+    </w:p>
+    <w:p>
+      <w:pPr>
+        <w:pStyle w:val="ListParagraph"/>
+        <w:numPr>
+          <w:ilvl w:val="0"/>
+          <w:numId w:val="2"/>
+        </w:numPr>
+      </w:pPr>
+      <w:r>
+        <w:t>The TIM2 counter is sampled.</w:t>
+      </w:r>
+    </w:p>
+    <w:p>
+      <w:pPr>
+        <w:pStyle w:val="ListParagraph"/>
+        <w:numPr>
+          <w:ilvl w:val="0"/>
+          <w:numId w:val="2"/>
+        </w:numPr>
+      </w:pPr>
+      <w:r>
+        <w:t>The number of ticks since the last PPS event is calculated.</w:t>
+      </w:r>
+    </w:p>
+    <w:p>
+      <w:pPr>
+        <w:pStyle w:val="ListParagraph"/>
+        <w:numPr>
+          <w:ilvl w:val="0"/>
+          <w:numId w:val="2"/>
+        </w:numPr>
+      </w:pPr>
+      <w:r>
+        <w:t>The ticks-per-second estimate EMA is updated. (initial</w:t>
+      </w:r>
+      <w:r>
+        <w:t>/nominal</w:t>
+      </w:r>
+      <w:r>
+        <w:t xml:space="preserve"> = 1,000,000)</w:t>
+      </w:r>
+    </w:p>
+    <w:p>
+      <w:pPr>
+        <w:pStyle w:val="ListParagraph"/>
+        <w:numPr>
+          <w:ilvl w:val="1"/>
+          <w:numId w:val="2"/>
+        </w:numPr>
+      </w:pPr>
+      <w:r>
+        <w:t>Used to interpolate a millisecond-resolution timestamp.</w:t>
+      </w:r>
+    </w:p>
+    <w:p>
+      <w:pPr>
+        <w:pStyle w:val="ListParagraph"/>
+        <w:numPr>
+          <w:ilvl w:val="0"/>
+          <w:numId w:val="2"/>
+        </w:numPr>
+      </w:pPr>
+      <w:r>
+        <w:t>The global epoch seconds counter is incremented</w:t>
+      </w:r>
+    </w:p>
+    <w:p>
+      <w:pPr>
+        <w:pStyle w:val="ListParagraph"/>
+        <w:numPr>
+          <w:ilvl w:val="0"/>
+          <w:numId w:val="2"/>
+        </w:numPr>
+      </w:pPr>
+      <w:r>
+        <w:t xml:space="preserve">If a </w:t>
+      </w:r>
+      <w:proofErr w:type="spellStart"/>
+      <w:r>
+        <w:t>systime</w:t>
+      </w:r>
+      <w:proofErr w:type="spellEnd"/>
+      <w:r>
+        <w:t xml:space="preserve"> update is enqueued, the system epoch seconds are updated to the new time.</w:t>
+      </w:r>
+    </w:p>
+    <w:p>
+      <w:pPr>
+        <w:pStyle w:val="ListParagraph"/>
+        <w:numPr>
+          <w:ilvl w:val="0"/>
+          <w:numId w:val="2"/>
+        </w:numPr>
+      </w:pPr>
+      <w:r>
+        <w:t>The PPS event moving-average calculation is the only work that’s done in the ISR.</w:t>
+      </w:r>
+    </w:p>
+    <w:p>
+      <w:pPr>
+        <w:pStyle w:val="Heading2"/>
+      </w:pPr>
+      <w:r>
+        <w:lastRenderedPageBreak/>
+        <w:t xml:space="preserve">The Main </w:t>
+      </w:r>
+      <w:proofErr w:type="gramStart"/>
+      <w:r>
+        <w:t>While(</w:t>
+      </w:r>
+      <w:proofErr w:type="gramEnd"/>
+      <w:r>
+        <w:t>1) Loop</w:t>
+      </w:r>
+    </w:p>
+    <w:p>
+      <w:r>
+        <w:t>The main while-loop is a tight sequence of services which exit early when not enabled.</w:t>
+      </w:r>
+    </w:p>
+    <w:p>
+      <w:pPr>
+        <w:pStyle w:val="Heading3"/>
+      </w:pPr>
+      <w:r>
+        <w:t xml:space="preserve">The Recorder </w:t>
+      </w:r>
+    </w:p>
     <w:p/>
     <w:p/>
     <w:p>
       <w:pPr>
-        <w:pStyle w:val="Heading1"/>
-      </w:pPr>
-      <w:r>
-        <w:t>System Architecture</w:t>
+        <w:pStyle w:val="Heading2"/>
+      </w:pPr>
+      <w:r>
+        <w:t>The Tasker Module</w:t>
       </w:r>
     </w:p>
     <w:p/>
     <w:p>
       <w:pPr>
+        <w:pStyle w:val="Heading3"/>
+      </w:pPr>
+      <w:r>
+        <w:t>Task Requirements</w:t>
+      </w:r>
+    </w:p>
+    <w:p/>
+    <w:p>
+      <w:pPr>
+        <w:pStyle w:val="Heading4"/>
+      </w:pPr>
+      <w:r>
+        <w:t>Task Scheduler</w:t>
+      </w:r>
+    </w:p>
+    <w:p/>
+    <w:p>
+      <w:pPr>
+        <w:pStyle w:val="Heading4"/>
+      </w:pPr>
+      <w:r>
+        <w:t>Task Handler</w:t>
+      </w:r>
+    </w:p>
+    <w:p/>
+    <w:p>
+      <w:pPr>
         <w:pStyle w:val="Heading2"/>
       </w:pPr>
       <w:r>
-        <w:t>Block Diagram</w:t>
+        <w:t>The Command Shell</w:t>
+      </w:r>
+      <w:r>
+        <w:t xml:space="preserve"> Task</w:t>
       </w:r>
     </w:p>
     <w:p/>
@@ -43,71 +544,16 @@
         <w:pStyle w:val="Heading2"/>
       </w:pPr>
       <w:r>
-        <w:t xml:space="preserve">The Main </w:t>
-      </w:r>
-      <w:proofErr w:type="gramStart"/>
-      <w:r>
-        <w:t>While(</w:t>
-      </w:r>
-      <w:proofErr w:type="gramEnd"/>
-      <w:r>
-        <w:t>1) Loop</w:t>
+        <w:t xml:space="preserve">The </w:t>
+      </w:r>
+      <w:r>
+        <w:t>Calculator</w:t>
+      </w:r>
+      <w:r>
+        <w:t xml:space="preserve"> </w:t>
       </w:r>
     </w:p>
     <w:p/>
-    <w:p>
-      <w:pPr>
-        <w:pStyle w:val="Heading2"/>
-      </w:pPr>
-      <w:r>
-        <w:t>The Command Shell</w:t>
-      </w:r>
-    </w:p>
-    <w:p/>
-    <w:p>
-      <w:pPr>
-        <w:pStyle w:val="Heading2"/>
-      </w:pPr>
-      <w:r>
-        <w:t>The Tasker Module</w:t>
-      </w:r>
-    </w:p>
-    <w:p/>
-    <w:p>
-      <w:pPr>
-        <w:pStyle w:val="Heading3"/>
-      </w:pPr>
-      <w:r>
-        <w:t>Task Requirements</w:t>
-      </w:r>
-    </w:p>
-    <w:p/>
-    <w:p>
-      <w:pPr>
-        <w:pStyle w:val="Heading4"/>
-      </w:pPr>
-      <w:r>
-        <w:t>Task Scheduler</w:t>
-      </w:r>
-    </w:p>
-    <w:p/>
-    <w:p>
-      <w:pPr>
-        <w:pStyle w:val="Heading4"/>
-      </w:pPr>
-      <w:r>
-        <w:t>Task Handler</w:t>
-      </w:r>
-    </w:p>
-    <w:p/>
-    <w:p>
-      <w:pPr>
-        <w:pStyle w:val="Heading2"/>
-      </w:pPr>
-      <w:r>
-        <w:t>The Recorder</w:t>
-      </w:r>
-    </w:p>
     <w:p/>
     <w:p/>
     <w:sectPr>
@@ -118,6 +564,243 @@
     </w:sectPr>
   </w:body>
 </w:document>
+</file>
+
+<file path=word/numbering.xml><?xml version="1.0" encoding="utf-8"?>
+<w:numbering xmlns:wpc="http://schemas.microsoft.com/office/word/2010/wordprocessingCanvas" xmlns:cx="http://schemas.microsoft.com/office/drawing/2014/chartex" xmlns:cx1="http://schemas.microsoft.com/office/drawing/2015/9/8/chartex" xmlns:cx2="http://schemas.microsoft.com/office/drawing/2015/10/21/chartex" xmlns:cx3="http://schemas.microsoft.com/office/drawing/2016/5/9/chartex" xmlns:cx4="http://schemas.microsoft.com/office/drawing/2016/5/10/chartex" xmlns:cx5="http://schemas.microsoft.com/office/drawing/2016/5/11/chartex" xmlns:cx6="http://schemas.microsoft.com/office/drawing/2016/5/12/chartex" xmlns:cx7="http://schemas.microsoft.com/office/drawing/2016/5/13/chartex" xmlns:cx8="http://schemas.microsoft.com/office/drawing/2016/5/14/chartex" xmlns:mc="http://schemas.openxmlformats.org/markup-compatibility/2006" xmlns:aink="http://schemas.microsoft.com/office/drawing/2016/ink" xmlns:am3d="http://schemas.microsoft.com/office/drawing/2017/model3d" xmlns:o="urn:schemas-microsoft-com:office:office" xmlns:oel="http://schemas.microsoft.com/office/2019/extlst" xmlns:r="http://schemas.openxmlformats.org/officeDocument/2006/relationships" xmlns:m="http://schemas.openxmlformats.org/officeDocument/2006/math" xmlns:v="urn:schemas-microsoft-com:vml" xmlns:wp14="http://schemas.microsoft.com/office/word/2010/wordprocessingDrawing" xmlns:wp="http://schemas.openxmlformats.org/drawingml/2006/wordprocessingDrawing" xmlns:w10="urn:schemas-microsoft-com:office:word" xmlns:w="http://schemas.openxmlformats.org/wordprocessingml/2006/main" xmlns:w14="http://schemas.microsoft.com/office/word/2010/wordml" xmlns:w15="http://schemas.microsoft.com/office/word/2012/wordml" xmlns:w16cex="http://schemas.microsoft.com/office/word/2018/wordml/cex" xmlns:w16cid="http://schemas.microsoft.com/office/word/2016/wordml/cid" xmlns:w16="http://schemas.microsoft.com/office/word/2018/wordml" xmlns:w16sdtdh="http://schemas.microsoft.com/office/word/2020/wordml/sdtdatahash" xmlns:w16se="http://schemas.microsoft.com/office/word/2015/wordml/symex" xmlns:wpg="http://schemas.microsoft.com/office/word/2010/wordprocessingGroup" xmlns:wpi="http://schemas.microsoft.com/office/word/2010/wordprocessingInk" xmlns:wne="http://schemas.microsoft.com/office/word/2006/wordml" xmlns:wps="http://schemas.microsoft.com/office/word/2010/wordprocessingShape" mc:Ignorable="w14 w15 w16se w16cid w16 w16cex w16sdtdh wp14">
+  <w:abstractNum w:abstractNumId="0" w15:restartNumberingAfterBreak="0">
+    <w:nsid w:val="067E4B93"/>
+    <w:multiLevelType w:val="hybridMultilevel"/>
+    <w:tmpl w:val="1A0A76FA"/>
+    <w:lvl w:ilvl="0" w:tplc="04090001">
+      <w:start w:val="1"/>
+      <w:numFmt w:val="bullet"/>
+      <w:lvlText w:val=""/>
+      <w:lvlJc w:val="left"/>
+      <w:pPr>
+        <w:ind w:left="720" w:hanging="360"/>
+      </w:pPr>
+      <w:rPr>
+        <w:rFonts w:ascii="Symbol" w:hAnsi="Symbol" w:hint="default"/>
+      </w:rPr>
+    </w:lvl>
+    <w:lvl w:ilvl="1" w:tplc="04090003" w:tentative="1">
+      <w:start w:val="1"/>
+      <w:numFmt w:val="bullet"/>
+      <w:lvlText w:val="o"/>
+      <w:lvlJc w:val="left"/>
+      <w:pPr>
+        <w:ind w:left="1440" w:hanging="360"/>
+      </w:pPr>
+      <w:rPr>
+        <w:rFonts w:ascii="Courier New" w:hAnsi="Courier New" w:cs="Courier New" w:hint="default"/>
+      </w:rPr>
+    </w:lvl>
+    <w:lvl w:ilvl="2" w:tplc="04090005" w:tentative="1">
+      <w:start w:val="1"/>
+      <w:numFmt w:val="bullet"/>
+      <w:lvlText w:val=""/>
+      <w:lvlJc w:val="left"/>
+      <w:pPr>
+        <w:ind w:left="2160" w:hanging="360"/>
+      </w:pPr>
+      <w:rPr>
+        <w:rFonts w:ascii="Wingdings" w:hAnsi="Wingdings" w:hint="default"/>
+      </w:rPr>
+    </w:lvl>
+    <w:lvl w:ilvl="3" w:tplc="04090001" w:tentative="1">
+      <w:start w:val="1"/>
+      <w:numFmt w:val="bullet"/>
+      <w:lvlText w:val=""/>
+      <w:lvlJc w:val="left"/>
+      <w:pPr>
+        <w:ind w:left="2880" w:hanging="360"/>
+      </w:pPr>
+      <w:rPr>
+        <w:rFonts w:ascii="Symbol" w:hAnsi="Symbol" w:hint="default"/>
+      </w:rPr>
+    </w:lvl>
+    <w:lvl w:ilvl="4" w:tplc="04090003" w:tentative="1">
+      <w:start w:val="1"/>
+      <w:numFmt w:val="bullet"/>
+      <w:lvlText w:val="o"/>
+      <w:lvlJc w:val="left"/>
+      <w:pPr>
+        <w:ind w:left="3600" w:hanging="360"/>
+      </w:pPr>
+      <w:rPr>
+        <w:rFonts w:ascii="Courier New" w:hAnsi="Courier New" w:cs="Courier New" w:hint="default"/>
+      </w:rPr>
+    </w:lvl>
+    <w:lvl w:ilvl="5" w:tplc="04090005" w:tentative="1">
+      <w:start w:val="1"/>
+      <w:numFmt w:val="bullet"/>
+      <w:lvlText w:val=""/>
+      <w:lvlJc w:val="left"/>
+      <w:pPr>
+        <w:ind w:left="4320" w:hanging="360"/>
+      </w:pPr>
+      <w:rPr>
+        <w:rFonts w:ascii="Wingdings" w:hAnsi="Wingdings" w:hint="default"/>
+      </w:rPr>
+    </w:lvl>
+    <w:lvl w:ilvl="6" w:tplc="04090001" w:tentative="1">
+      <w:start w:val="1"/>
+      <w:numFmt w:val="bullet"/>
+      <w:lvlText w:val=""/>
+      <w:lvlJc w:val="left"/>
+      <w:pPr>
+        <w:ind w:left="5040" w:hanging="360"/>
+      </w:pPr>
+      <w:rPr>
+        <w:rFonts w:ascii="Symbol" w:hAnsi="Symbol" w:hint="default"/>
+      </w:rPr>
+    </w:lvl>
+    <w:lvl w:ilvl="7" w:tplc="04090003" w:tentative="1">
+      <w:start w:val="1"/>
+      <w:numFmt w:val="bullet"/>
+      <w:lvlText w:val="o"/>
+      <w:lvlJc w:val="left"/>
+      <w:pPr>
+        <w:ind w:left="5760" w:hanging="360"/>
+      </w:pPr>
+      <w:rPr>
+        <w:rFonts w:ascii="Courier New" w:hAnsi="Courier New" w:cs="Courier New" w:hint="default"/>
+      </w:rPr>
+    </w:lvl>
+    <w:lvl w:ilvl="8" w:tplc="04090005" w:tentative="1">
+      <w:start w:val="1"/>
+      <w:numFmt w:val="bullet"/>
+      <w:lvlText w:val=""/>
+      <w:lvlJc w:val="left"/>
+      <w:pPr>
+        <w:ind w:left="6480" w:hanging="360"/>
+      </w:pPr>
+      <w:rPr>
+        <w:rFonts w:ascii="Wingdings" w:hAnsi="Wingdings" w:hint="default"/>
+      </w:rPr>
+    </w:lvl>
+  </w:abstractNum>
+  <w:abstractNum w:abstractNumId="1" w15:restartNumberingAfterBreak="0">
+    <w:nsid w:val="343D45AC"/>
+    <w:multiLevelType w:val="hybridMultilevel"/>
+    <w:tmpl w:val="375C1016"/>
+    <w:lvl w:ilvl="0" w:tplc="04090001">
+      <w:start w:val="1"/>
+      <w:numFmt w:val="bullet"/>
+      <w:lvlText w:val=""/>
+      <w:lvlJc w:val="left"/>
+      <w:pPr>
+        <w:ind w:left="825" w:hanging="360"/>
+      </w:pPr>
+      <w:rPr>
+        <w:rFonts w:ascii="Symbol" w:hAnsi="Symbol" w:hint="default"/>
+      </w:rPr>
+    </w:lvl>
+    <w:lvl w:ilvl="1" w:tplc="04090003">
+      <w:start w:val="1"/>
+      <w:numFmt w:val="bullet"/>
+      <w:lvlText w:val="o"/>
+      <w:lvlJc w:val="left"/>
+      <w:pPr>
+        <w:ind w:left="1545" w:hanging="360"/>
+      </w:pPr>
+      <w:rPr>
+        <w:rFonts w:ascii="Courier New" w:hAnsi="Courier New" w:cs="Courier New" w:hint="default"/>
+      </w:rPr>
+    </w:lvl>
+    <w:lvl w:ilvl="2" w:tplc="04090005" w:tentative="1">
+      <w:start w:val="1"/>
+      <w:numFmt w:val="bullet"/>
+      <w:lvlText w:val=""/>
+      <w:lvlJc w:val="left"/>
+      <w:pPr>
+        <w:ind w:left="2265" w:hanging="360"/>
+      </w:pPr>
+      <w:rPr>
+        <w:rFonts w:ascii="Wingdings" w:hAnsi="Wingdings" w:hint="default"/>
+      </w:rPr>
+    </w:lvl>
+    <w:lvl w:ilvl="3" w:tplc="04090001" w:tentative="1">
+      <w:start w:val="1"/>
+      <w:numFmt w:val="bullet"/>
+      <w:lvlText w:val=""/>
+      <w:lvlJc w:val="left"/>
+      <w:pPr>
+        <w:ind w:left="2985" w:hanging="360"/>
+      </w:pPr>
+      <w:rPr>
+        <w:rFonts w:ascii="Symbol" w:hAnsi="Symbol" w:hint="default"/>
+      </w:rPr>
+    </w:lvl>
+    <w:lvl w:ilvl="4" w:tplc="04090003" w:tentative="1">
+      <w:start w:val="1"/>
+      <w:numFmt w:val="bullet"/>
+      <w:lvlText w:val="o"/>
+      <w:lvlJc w:val="left"/>
+      <w:pPr>
+        <w:ind w:left="3705" w:hanging="360"/>
+      </w:pPr>
+      <w:rPr>
+        <w:rFonts w:ascii="Courier New" w:hAnsi="Courier New" w:cs="Courier New" w:hint="default"/>
+      </w:rPr>
+    </w:lvl>
+    <w:lvl w:ilvl="5" w:tplc="04090005" w:tentative="1">
+      <w:start w:val="1"/>
+      <w:numFmt w:val="bullet"/>
+      <w:lvlText w:val=""/>
+      <w:lvlJc w:val="left"/>
+      <w:pPr>
+        <w:ind w:left="4425" w:hanging="360"/>
+      </w:pPr>
+      <w:rPr>
+        <w:rFonts w:ascii="Wingdings" w:hAnsi="Wingdings" w:hint="default"/>
+      </w:rPr>
+    </w:lvl>
+    <w:lvl w:ilvl="6" w:tplc="04090001" w:tentative="1">
+      <w:start w:val="1"/>
+      <w:numFmt w:val="bullet"/>
+      <w:lvlText w:val=""/>
+      <w:lvlJc w:val="left"/>
+      <w:pPr>
+        <w:ind w:left="5145" w:hanging="360"/>
+      </w:pPr>
+      <w:rPr>
+        <w:rFonts w:ascii="Symbol" w:hAnsi="Symbol" w:hint="default"/>
+      </w:rPr>
+    </w:lvl>
+    <w:lvl w:ilvl="7" w:tplc="04090003" w:tentative="1">
+      <w:start w:val="1"/>
+      <w:numFmt w:val="bullet"/>
+      <w:lvlText w:val="o"/>
+      <w:lvlJc w:val="left"/>
+      <w:pPr>
+        <w:ind w:left="5865" w:hanging="360"/>
+      </w:pPr>
+      <w:rPr>
+        <w:rFonts w:ascii="Courier New" w:hAnsi="Courier New" w:cs="Courier New" w:hint="default"/>
+      </w:rPr>
+    </w:lvl>
+    <w:lvl w:ilvl="8" w:tplc="04090005" w:tentative="1">
+      <w:start w:val="1"/>
+      <w:numFmt w:val="bullet"/>
+      <w:lvlText w:val=""/>
+      <w:lvlJc w:val="left"/>
+      <w:pPr>
+        <w:ind w:left="6585" w:hanging="360"/>
+      </w:pPr>
+      <w:rPr>
+        <w:rFonts w:ascii="Wingdings" w:hAnsi="Wingdings" w:hint="default"/>
+      </w:rPr>
+    </w:lvl>
+  </w:abstractNum>
+  <w:num w:numId="1" w16cid:durableId="101924797">
+    <w:abstractNumId w:val="0"/>
+  </w:num>
+  <w:num w:numId="2" w16cid:durableId="82843363">
+    <w:abstractNumId w:val="1"/>
+  </w:num>
+</w:numbering>
 </file>
 
 <file path=word/styles.xml><?xml version="1.0" encoding="utf-8"?>

</xml_diff>